<commit_message>
fix(va-disability): apply consistency-check corrections to C&P exam prep
Exam weekday corrected to Wednesday 21 Oct 2026; prep now stays consistent
with the signed personal statement's 2022 Starlite-therapist disclosure;
corrected OCD coding sources, Poquette disclosure timing, perpetrator-source
and caregiving-detail attribution, Recover 5/15 PTSD reference; mock Report B
social facts converted to fill-in brackets.

Co-Authored-By: Claude Opus 5.5 <noreply@anthropic.com>
Claude-Session: https://claude.ai/code/session_0181jKaPtfDKzjAxBEVuAoU1
</commit_message>
<xml_diff>
--- a/va-disability/planning-docs/cp-exam/CP-EXAM-DAY-NOTES-2026-10-21.docx
+++ b/va-disability/planning-docs/cp-exam/CP-EXAM-DAY-NOTES-2026-10-21.docx
@@ -28,7 +28,7 @@
           <w:sz w:val="20"/>
           <w:szCs w:val="20"/>
         </w:rPr>
-        <w:t xml:space="preserve">Tuesday 21 Oct 2026 · VES telehealth (video) · Erica attending · Mental disorders / Initial PTSD (MST) · PTSD · MDD · GAD · OCD · SUD secondary</w:t>
+        <w:t xml:space="preserve">Wednesday 21 Oct 2026 · VES telehealth (video) · Erica attending · Mental disorders / Initial PTSD (MST) · PTSD · MDD · GAD · OCD · SUD secondary</w:t>
       </w:r>
     </w:p>
     <w:p>
@@ -873,7 +873,7 @@
                 <w:sz w:val="19"/>
                 <w:szCs w:val="19"/>
               </w:rPr>
-              <w:t xml:space="preserve">Drinking up, insomnia (Ambien/Restoril), withdrew; told Poquette (in service) and Reyes ("late 2013")</w:t>
+              <w:t xml:space="preserve">Drinking up, insomnia (Ambien/Restoril), withdrew; told Poquette (his statement gives no date) and Reyes ("late 2013")</w:t>
             </w:r>
           </w:p>
         </w:tc>
@@ -1976,7 +1976,7 @@
           <w:sz w:val="20"/>
           <w:szCs w:val="20"/>
         </w:rPr>
-        <w:t xml:space="preserve">PTSD, MDD, GAD, OCD, SUD (opioid, sedative) — Cherie Mills, LCSW; MDD/GAD/OCD also coded at Starlite 2023–24, Harmony 2026, Recover 2026. Self-reported autism spectrum. F15.20 (amphetamine) at Harmony — if unknown, say so; don't invent.</w:t>
+        <w:t xml:space="preserve">PTSD, MDD, GAD, OCD, SUD (opioid, sedative) — Cherie Mills, LCSW; MDD/GAD also coded at Starlite 2023–24, Harmony 2026, Recover 2026; OCD coded at Starlite Jul–Aug 2023 and Jul–Aug 2024. Recover 5/15 eval mentions PTSD as "childhood trauma and military experiences." Self-reported autism spectrum. F15.20 (amphetamine) at Harmony — if unknown, say so; don't invent.</w:t>
       </w:r>
     </w:p>
     <w:p>
@@ -2696,7 +2696,7 @@
           <w:sz w:val="28"/>
           <w:szCs w:val="28"/>
         </w:rPr>
-        <w:t xml:space="preserve">4. My real numbers — fill in with Erica before Tuesday</w:t>
+        <w:t xml:space="preserve">4. My real numbers — fill in with Erica before Wednesday</w:t>
       </w:r>
     </w:p>
     <w:p>
@@ -4991,7 +4991,7 @@
                 <w:sz w:val="19"/>
                 <w:szCs w:val="19"/>
               </w:rPr>
-              <w:t xml:space="preserve">Your own reasons: shame, didn't see it as assault, distrust, fear of holds, not ready until Cherie.</w:t>
+              <w:t xml:space="preserve">Your own reasons: shame, didn't see it as assault, distrust, fear of holds. Stay consistent with your signed statement (told a Starlite therapist in 2022).</w:t>
             </w:r>
           </w:p>
         </w:tc>
@@ -5583,7 +5583,7 @@
           <w:sz w:val="20"/>
           <w:szCs w:val="20"/>
         </w:rPr>
-        <w:t xml:space="preserve">First real disclosure came after I trusted Cherie (since 2023).</w:t>
+        <w:t xml:space="preserve">My signed statement says I told a Starlite therapist in 2022 (it says "Melissa Robbins"; records say "Robbin Lynch") — what is true about that: ________________</w:t>
       </w:r>
     </w:p>
     <w:p>
@@ -5601,23 +5601,7 @@
           <w:sz w:val="20"/>
           <w:szCs w:val="20"/>
         </w:rPr>
-        <w:t xml:space="preserve">2022 Starlite LEC-5 — what was true about checking that box: ________________</w:t>
-      </w:r>
-    </w:p>
-    <w:p>
-      <w:pPr>
-        <w:keepNext/>
-        <w:spacing w:after="30" w:before="0"/>
-      </w:pPr>
-      <w:r>
-        <w:rPr>
-          <w:rFonts w:ascii="Calibri" w:cs="Calibri" w:eastAsia="Calibri" w:hAnsi="Calibri"/>
-          <w:b/>
-          <w:bCs/>
-          <w:sz w:val="20"/>
-          <w:szCs w:val="20"/>
-        </w:rPr>
-        <w:t xml:space="preserve">"Your records say anxiety/depression and kratom at 18."</w:t>
+        <w:t xml:space="preserve">Worked through it in depth with Cherie (since 2023).</w:t>
       </w:r>
     </w:p>
     <w:p>
@@ -5635,7 +5619,23 @@
           <w:sz w:val="20"/>
           <w:szCs w:val="20"/>
         </w:rPr>
-        <w:t xml:space="preserve">What exactly happened then (who, how long, how bad): ________________</w:t>
+        <w:t xml:space="preserve">2022 Starlite LEC-5 — what was true about checking that box: ________________</w:t>
+      </w:r>
+    </w:p>
+    <w:p>
+      <w:pPr>
+        <w:keepNext/>
+        <w:spacing w:after="30" w:before="0"/>
+      </w:pPr>
+      <w:r>
+        <w:rPr>
+          <w:rFonts w:ascii="Calibri" w:cs="Calibri" w:eastAsia="Calibri" w:hAnsi="Calibri"/>
+          <w:b/>
+          <w:bCs/>
+          <w:sz w:val="20"/>
+          <w:szCs w:val="20"/>
+        </w:rPr>
+        <w:t xml:space="preserve">"Your records say anxiety/depression and kratom at 18."</w:t>
       </w:r>
     </w:p>
     <w:p>
@@ -5653,7 +5653,7 @@
           <w:sz w:val="20"/>
           <w:szCs w:val="20"/>
         </w:rPr>
-        <w:t xml:space="preserve">How I functioned then: graduated, MEPS, enlisted, BMT Honor Grad.</w:t>
+        <w:t xml:space="preserve">What exactly happened then (who, how long, how bad): ________________</w:t>
       </w:r>
     </w:p>
     <w:p>
@@ -5671,23 +5671,7 @@
           <w:sz w:val="20"/>
           <w:szCs w:val="20"/>
         </w:rPr>
-        <w:t xml:space="preserve">What was new or worse after 2012: nightmares, hypervigilance, shame, panic, SI, the disorder-level drug use.</w:t>
-      </w:r>
-    </w:p>
-    <w:p>
-      <w:pPr>
-        <w:keepNext/>
-        <w:spacing w:after="30" w:before="0"/>
-      </w:pPr>
-      <w:r>
-        <w:rPr>
-          <w:rFonts w:ascii="Calibri" w:cs="Calibri" w:eastAsia="Calibri" w:hAnsi="Calibri"/>
-          <w:b/>
-          <w:bCs/>
-          <w:sz w:val="20"/>
-          <w:szCs w:val="20"/>
-        </w:rPr>
-        <w:t xml:space="preserve">"You denied SI on 5/14 and ~6/25 but wrote 'every day' on 6/17."</w:t>
+        <w:t xml:space="preserve">How I functioned then: graduated, MEPS, enlisted, BMT Honor Grad.</w:t>
       </w:r>
     </w:p>
     <w:p>
@@ -5705,7 +5689,23 @@
           <w:sz w:val="20"/>
           <w:szCs w:val="20"/>
         </w:rPr>
-        <w:t xml:space="preserve">My actual pattern: ________________</w:t>
+        <w:t xml:space="preserve">What was new or worse after 2012: nightmares, hypervigilance, shame, panic, SI, the disorder-level drug use.</w:t>
+      </w:r>
+    </w:p>
+    <w:p>
+      <w:pPr>
+        <w:keepNext/>
+        <w:spacing w:after="30" w:before="0"/>
+      </w:pPr>
+      <w:r>
+        <w:rPr>
+          <w:rFonts w:ascii="Calibri" w:cs="Calibri" w:eastAsia="Calibri" w:hAnsi="Calibri"/>
+          <w:b/>
+          <w:bCs/>
+          <w:sz w:val="20"/>
+          <w:szCs w:val="20"/>
+        </w:rPr>
+        <w:t xml:space="preserve">"You denied SI on 5/14 and ~6/25 but wrote 'every day' on 6/17."</w:t>
       </w:r>
     </w:p>
     <w:p>
@@ -5723,23 +5723,7 @@
           <w:sz w:val="20"/>
           <w:szCs w:val="20"/>
         </w:rPr>
-        <w:t xml:space="preserve">I deny it to new providers to avoid involuntary holds (Cherie documented this).</w:t>
-      </w:r>
-    </w:p>
-    <w:p>
-      <w:pPr>
-        <w:keepNext/>
-        <w:spacing w:after="30" w:before="0"/>
-      </w:pPr>
-      <w:r>
-        <w:rPr>
-          <w:rFonts w:ascii="Calibri" w:cs="Calibri" w:eastAsia="Calibri" w:hAnsi="Calibri"/>
-          <w:b/>
-          <w:bCs/>
-          <w:sz w:val="20"/>
-          <w:szCs w:val="20"/>
-        </w:rPr>
-        <w:t xml:space="preserve">"You were 'gainfully employed' in 2024 and got a CTO offer."</w:t>
+        <w:t xml:space="preserve">My actual pattern: ________________</w:t>
       </w:r>
     </w:p>
     <w:p>
@@ -5757,7 +5741,23 @@
           <w:sz w:val="20"/>
           <w:szCs w:val="20"/>
         </w:rPr>
-        <w:t xml:space="preserve">Employed mid-2024 — then laid off Dec 2024; June 2026 PIP/severance; then left the field.</w:t>
+        <w:t xml:space="preserve">I deny it to new providers to avoid involuntary holds (Cherie documented this).</w:t>
+      </w:r>
+    </w:p>
+    <w:p>
+      <w:pPr>
+        <w:keepNext/>
+        <w:spacing w:after="30" w:before="0"/>
+      </w:pPr>
+      <w:r>
+        <w:rPr>
+          <w:rFonts w:ascii="Calibri" w:cs="Calibri" w:eastAsia="Calibri" w:hAnsi="Calibri"/>
+          <w:b/>
+          <w:bCs/>
+          <w:sz w:val="20"/>
+          <w:szCs w:val="20"/>
+        </w:rPr>
+        <w:t xml:space="preserve">"You were 'gainfully employed' in 2024 and got a CTO offer."</w:t>
       </w:r>
     </w:p>
     <w:p>
@@ -5775,23 +5775,7 @@
           <w:sz w:val="20"/>
           <w:szCs w:val="20"/>
         </w:rPr>
-        <w:t xml:space="preserve">Overwork was driven by the fear of being fired; it always ended in collapse/relapse/treatment.</w:t>
-      </w:r>
-    </w:p>
-    <w:p>
-      <w:pPr>
-        <w:keepNext/>
-        <w:spacing w:after="30" w:before="0"/>
-      </w:pPr>
-      <w:r>
-        <w:rPr>
-          <w:rFonts w:ascii="Calibri" w:cs="Calibri" w:eastAsia="Calibri" w:hAnsi="Calibri"/>
-          <w:b/>
-          <w:bCs/>
-          <w:sz w:val="20"/>
-          <w:szCs w:val="20"/>
-        </w:rPr>
-        <w:t xml:space="preserve">"You're married and go to AA — that's social."</w:t>
+        <w:t xml:space="preserve">Employed mid-2024 — then laid off Dec 2024; June 2026 PIP/severance; then left the field.</w:t>
       </w:r>
     </w:p>
     <w:p>
@@ -5809,7 +5793,23 @@
           <w:sz w:val="20"/>
           <w:szCs w:val="20"/>
         </w:rPr>
-        <w:t xml:space="preserve">What Erica does for me day to day, and what I can give back: ________________</w:t>
+        <w:t xml:space="preserve">Overwork was driven by the fear of being fired; it always ended in collapse/relapse/treatment.</w:t>
+      </w:r>
+    </w:p>
+    <w:p>
+      <w:pPr>
+        <w:keepNext/>
+        <w:spacing w:after="30" w:before="0"/>
+      </w:pPr>
+      <w:r>
+        <w:rPr>
+          <w:rFonts w:ascii="Calibri" w:cs="Calibri" w:eastAsia="Calibri" w:hAnsi="Calibri"/>
+          <w:b/>
+          <w:bCs/>
+          <w:sz w:val="20"/>
+          <w:szCs w:val="20"/>
+        </w:rPr>
+        <w:t xml:space="preserve">"You're married and go to AA — that's social."</w:t>
       </w:r>
     </w:p>
     <w:p>
@@ -5827,7 +5827,7 @@
           <w:sz w:val="20"/>
           <w:szCs w:val="20"/>
         </w:rPr>
-        <w:t xml:space="preserve">AA: how often, whether I speak, who knows me: ________________</w:t>
+        <w:t xml:space="preserve">What Erica does for me day to day, and what I can give back: ________________</w:t>
       </w:r>
     </w:p>
     <w:p>
@@ -5845,23 +5845,7 @@
           <w:sz w:val="20"/>
           <w:szCs w:val="20"/>
         </w:rPr>
-        <w:t xml:space="preserve">Friends/family outside the marriage — last real contact: ________________</w:t>
-      </w:r>
-    </w:p>
-    <w:p>
-      <w:pPr>
-        <w:keepNext/>
-        <w:spacing w:after="30" w:before="0"/>
-      </w:pPr>
-      <w:r>
-        <w:rPr>
-          <w:rFonts w:ascii="Calibri" w:cs="Calibri" w:eastAsia="Calibri" w:hAnsi="Calibri"/>
-          <w:b/>
-          <w:bCs/>
-          <w:sz w:val="20"/>
-          <w:szCs w:val="20"/>
-        </w:rPr>
-        <w:t xml:space="preserve">"Are your symptoms just the opioids?"</w:t>
+        <w:t xml:space="preserve">AA: how often, whether I speak, who knows me: ________________</w:t>
       </w:r>
     </w:p>
     <w:p>
@@ -5879,7 +5863,23 @@
           <w:sz w:val="20"/>
           <w:szCs w:val="20"/>
         </w:rPr>
-        <w:t xml:space="preserve">Symptoms started after 2012, before the opioid disorder.</w:t>
+        <w:t xml:space="preserve">Friends/family outside the marriage — last real contact: ________________</w:t>
+      </w:r>
+    </w:p>
+    <w:p>
+      <w:pPr>
+        <w:keepNext/>
+        <w:spacing w:after="30" w:before="0"/>
+      </w:pPr>
+      <w:r>
+        <w:rPr>
+          <w:rFonts w:ascii="Calibri" w:cs="Calibri" w:eastAsia="Calibri" w:hAnsi="Calibri"/>
+          <w:b/>
+          <w:bCs/>
+          <w:sz w:val="20"/>
+          <w:szCs w:val="20"/>
+        </w:rPr>
+        <w:t xml:space="preserve">"Are your symptoms just the opioids?"</w:t>
       </w:r>
     </w:p>
     <w:p>
@@ -5897,7 +5897,7 @@
           <w:sz w:val="20"/>
           <w:szCs w:val="20"/>
         </w:rPr>
-        <w:t xml:space="preserve">During sober stretches / residential: ________________</w:t>
+        <w:t xml:space="preserve">Symptoms started after 2012, before the opioid disorder.</w:t>
       </w:r>
     </w:p>
     <w:p>
@@ -5915,23 +5915,7 @@
           <w:sz w:val="20"/>
           <w:szCs w:val="20"/>
         </w:rPr>
-        <w:t xml:space="preserve">What using does for me (quiets panic, sleep, numbs memories/fear): ________________</w:t>
-      </w:r>
-    </w:p>
-    <w:p>
-      <w:pPr>
-        <w:keepNext/>
-        <w:spacing w:after="30" w:before="0"/>
-      </w:pPr>
-      <w:r>
-        <w:rPr>
-          <w:rFonts w:ascii="Calibri" w:cs="Calibri" w:eastAsia="Calibri" w:hAnsi="Calibri"/>
-          <w:b/>
-          <w:bCs/>
-          <w:sz w:val="20"/>
-          <w:szCs w:val="20"/>
-        </w:rPr>
-        <w:t xml:space="preserve">"Was she a service member?"</w:t>
+        <w:t xml:space="preserve">During sober stretches / residential: ________________</w:t>
       </w:r>
     </w:p>
     <w:p>
@@ -5949,7 +5933,7 @@
           <w:sz w:val="20"/>
           <w:szCs w:val="20"/>
         </w:rPr>
-        <w:t xml:space="preserve">No — a coworker's wife; the 21-0781 entry was an error. Reyes, Poquette, my statement and Cherie's notes all say coworker's wife.</w:t>
+        <w:t xml:space="preserve">What using does for me (quiets panic, sleep, numbs memories/fear): ________________</w:t>
       </w:r>
     </w:p>
     <w:p>
@@ -5965,7 +5949,7 @@
           <w:sz w:val="20"/>
           <w:szCs w:val="20"/>
         </w:rPr>
-        <w:t xml:space="preserve">"Who manages your money?"</w:t>
+        <w:t xml:space="preserve">"Was she a service member?"</w:t>
       </w:r>
     </w:p>
     <w:p>
@@ -5983,6 +5967,40 @@
           <w:sz w:val="20"/>
           <w:szCs w:val="20"/>
         </w:rPr>
+        <w:t xml:space="preserve">No — a coworker's wife; the 21-0781 entry was an error. Reyes ("wife of a coworker"), Poquette ("one of our friend's wife"), my personal statement and CPT worksheet agree.</w:t>
+      </w:r>
+    </w:p>
+    <w:p>
+      <w:pPr>
+        <w:keepNext/>
+        <w:spacing w:after="30" w:before="0"/>
+      </w:pPr>
+      <w:r>
+        <w:rPr>
+          <w:rFonts w:ascii="Calibri" w:cs="Calibri" w:eastAsia="Calibri" w:hAnsi="Calibri"/>
+          <w:b/>
+          <w:bCs/>
+          <w:sz w:val="20"/>
+          <w:szCs w:val="20"/>
+        </w:rPr>
+        <w:t xml:space="preserve">"Who manages your money?"</w:t>
+      </w:r>
+    </w:p>
+    <w:p>
+      <w:pPr>
+        <w:pStyle w:val="ListParagraph"/>
+        <w:numPr>
+          <w:ilvl w:val="0"/>
+          <w:numId w:val="2"/>
+        </w:numPr>
+        <w:spacing w:after="40" w:before="0"/>
+      </w:pPr>
+      <w:r>
+        <w:rPr>
+          <w:rFonts w:ascii="Calibri" w:cs="Calibri" w:eastAsia="Calibri" w:hAnsi="Calibri"/>
+          <w:sz w:val="20"/>
+          <w:szCs w:val="20"/>
+        </w:rPr>
         <w:t xml:space="preserve">Truthful answer: ________________ (an honest "Erica does" may lead VA to propose a fiduciary — that's okay; never shade it).</w:t>
       </w:r>
     </w:p>
@@ -6095,6 +6113,24 @@
           <w:szCs w:val="20"/>
         </w:rPr>
         <w:t xml:space="preserve">Harmony Junction: 24 days by discharge dates (my statement said 25).</w:t>
+      </w:r>
+    </w:p>
+    <w:p>
+      <w:pPr>
+        <w:pStyle w:val="ListParagraph"/>
+        <w:numPr>
+          <w:ilvl w:val="0"/>
+          <w:numId w:val="2"/>
+        </w:numPr>
+        <w:spacing w:after="40" w:before="0"/>
+      </w:pPr>
+      <w:r>
+        <w:rPr>
+          <w:rFonts w:ascii="Calibri" w:cs="Calibri" w:eastAsia="Calibri" w:hAnsi="Calibri"/>
+          <w:sz w:val="20"/>
+          <w:szCs w:val="20"/>
+        </w:rPr>
+        <w:t xml:space="preserve">2022 Starlite therapist: my statement says "Melissa Robbins"; Starlite records say "Robbin Lynch, MS, LCDC" — give the name as best I remember.</w:t>
       </w:r>
     </w:p>
     <w:p>

</xml_diff>